<commit_message>
se subio la fase 2
</commit_message>
<xml_diff>
--- a/docs/fase-2-requerimientos/Fase_2_Requerimientos_Floristeria.docx
+++ b/docs/fase-2-requerimientos/Fase_2_Requerimientos_Floristeria.docx
@@ -92,7 +92,6 @@
           <w:docPartUnique/>
         </w:docPartObj>
       </w:sdtPr>
-      <w:sdtEndPr/>
       <w:sdtContent>
         <w:p>
           <w:pPr>
@@ -1879,34 +1878,14 @@
                 <w:color w:val="000000" w:themeColor="text1"/>
               </w:rPr>
             </w:pPr>
-            <w:proofErr w:type="spellStart"/>
             <w:r>
               <w:rPr>
                 <w:b/>
                 <w:color w:val="000000" w:themeColor="text1"/>
                 <w:sz w:val="18"/>
               </w:rPr>
-              <w:t>Requerimiento</w:t>
-            </w:r>
-            <w:proofErr w:type="spellEnd"/>
-            <w:r>
-              <w:rPr>
-                <w:b/>
-                <w:color w:val="000000" w:themeColor="text1"/>
-                <w:sz w:val="18"/>
-              </w:rPr>
-              <w:t xml:space="preserve"> </w:t>
-            </w:r>
-            <w:proofErr w:type="spellStart"/>
-            <w:r>
-              <w:rPr>
-                <w:b/>
-                <w:color w:val="000000" w:themeColor="text1"/>
-                <w:sz w:val="18"/>
-              </w:rPr>
-              <w:t>funcional</w:t>
-            </w:r>
-            <w:proofErr w:type="spellEnd"/>
+              <w:t>Requerimiento funcional</w:t>
+            </w:r>
           </w:p>
         </w:tc>
         <w:tc>
@@ -1921,7 +1900,6 @@
                 <w:color w:val="000000" w:themeColor="text1"/>
               </w:rPr>
             </w:pPr>
-            <w:proofErr w:type="spellStart"/>
             <w:r>
               <w:rPr>
                 <w:b/>
@@ -1930,7 +1908,6 @@
               </w:rPr>
               <w:t>Prioridad</w:t>
             </w:r>
-            <w:proofErr w:type="spellEnd"/>
           </w:p>
         </w:tc>
         <w:tc>
@@ -2498,31 +2475,9 @@
         <w:rPr>
           <w:color w:val="000000" w:themeColor="text1"/>
         </w:rPr>
-        <w:t xml:space="preserve">RF-007 a RF-014 — </w:t>
-      </w:r>
-      <w:proofErr w:type="spellStart"/>
-      <w:r>
-        <w:rPr>
-          <w:color w:val="000000" w:themeColor="text1"/>
-        </w:rPr>
-        <w:t>Catálogo</w:t>
-      </w:r>
-      <w:proofErr w:type="spellEnd"/>
-      <w:r>
-        <w:rPr>
-          <w:color w:val="000000" w:themeColor="text1"/>
-        </w:rPr>
-        <w:t xml:space="preserve"> de </w:t>
-      </w:r>
-      <w:proofErr w:type="spellStart"/>
-      <w:r>
-        <w:rPr>
-          <w:color w:val="000000" w:themeColor="text1"/>
-        </w:rPr>
-        <w:t>productos</w:t>
+        <w:t>RF-007 a RF-014 — Catálogo de productos</w:t>
       </w:r>
       <w:bookmarkEnd w:id="2"/>
-      <w:proofErr w:type="spellEnd"/>
     </w:p>
     <w:tbl>
       <w:tblPr>
@@ -2575,34 +2530,14 @@
                 <w:color w:val="000000" w:themeColor="text1"/>
               </w:rPr>
             </w:pPr>
-            <w:proofErr w:type="spellStart"/>
             <w:r>
               <w:rPr>
                 <w:b/>
                 <w:color w:val="000000" w:themeColor="text1"/>
                 <w:sz w:val="18"/>
               </w:rPr>
-              <w:t>Requerimiento</w:t>
-            </w:r>
-            <w:proofErr w:type="spellEnd"/>
-            <w:r>
-              <w:rPr>
-                <w:b/>
-                <w:color w:val="000000" w:themeColor="text1"/>
-                <w:sz w:val="18"/>
-              </w:rPr>
-              <w:t xml:space="preserve"> </w:t>
-            </w:r>
-            <w:proofErr w:type="spellStart"/>
-            <w:r>
-              <w:rPr>
-                <w:b/>
-                <w:color w:val="000000" w:themeColor="text1"/>
-                <w:sz w:val="18"/>
-              </w:rPr>
-              <w:t>funcional</w:t>
-            </w:r>
-            <w:proofErr w:type="spellEnd"/>
+              <w:t>Requerimiento funcional</w:t>
+            </w:r>
           </w:p>
         </w:tc>
         <w:tc>
@@ -2617,7 +2552,6 @@
                 <w:color w:val="000000" w:themeColor="text1"/>
               </w:rPr>
             </w:pPr>
-            <w:proofErr w:type="spellStart"/>
             <w:r>
               <w:rPr>
                 <w:b/>
@@ -2626,7 +2560,6 @@
               </w:rPr>
               <w:t>Prioridad</w:t>
             </w:r>
-            <w:proofErr w:type="spellEnd"/>
           </w:p>
         </w:tc>
         <w:tc>
@@ -3435,34 +3368,14 @@
                 <w:color w:val="000000" w:themeColor="text1"/>
               </w:rPr>
             </w:pPr>
-            <w:proofErr w:type="spellStart"/>
             <w:r>
               <w:rPr>
                 <w:b/>
                 <w:color w:val="000000" w:themeColor="text1"/>
                 <w:sz w:val="18"/>
               </w:rPr>
-              <w:t>Requerimiento</w:t>
-            </w:r>
-            <w:proofErr w:type="spellEnd"/>
-            <w:r>
-              <w:rPr>
-                <w:b/>
-                <w:color w:val="000000" w:themeColor="text1"/>
-                <w:sz w:val="18"/>
-              </w:rPr>
-              <w:t xml:space="preserve"> </w:t>
-            </w:r>
-            <w:proofErr w:type="spellStart"/>
-            <w:r>
-              <w:rPr>
-                <w:b/>
-                <w:color w:val="000000" w:themeColor="text1"/>
-                <w:sz w:val="18"/>
-              </w:rPr>
-              <w:t>funcional</w:t>
-            </w:r>
-            <w:proofErr w:type="spellEnd"/>
+              <w:t>Requerimiento funcional</w:t>
+            </w:r>
           </w:p>
         </w:tc>
         <w:tc>
@@ -3477,7 +3390,6 @@
                 <w:color w:val="000000" w:themeColor="text1"/>
               </w:rPr>
             </w:pPr>
-            <w:proofErr w:type="spellStart"/>
             <w:r>
               <w:rPr>
                 <w:b/>
@@ -3486,7 +3398,6 @@
               </w:rPr>
               <w:t>Prioridad</w:t>
             </w:r>
-            <w:proofErr w:type="spellEnd"/>
           </w:p>
         </w:tc>
         <w:tc>
@@ -3880,17 +3791,9 @@
         <w:rPr>
           <w:color w:val="000000" w:themeColor="text1"/>
         </w:rPr>
-        <w:t xml:space="preserve">RF-019 a RF-022 — </w:t>
-      </w:r>
-      <w:proofErr w:type="spellStart"/>
-      <w:r>
-        <w:rPr>
-          <w:color w:val="000000" w:themeColor="text1"/>
-        </w:rPr>
-        <w:t>Carrito</w:t>
+        <w:t>RF-019 a RF-022 — Carrito</w:t>
       </w:r>
       <w:bookmarkEnd w:id="4"/>
-      <w:proofErr w:type="spellEnd"/>
     </w:p>
     <w:tbl>
       <w:tblPr>
@@ -3943,34 +3846,14 @@
                 <w:color w:val="000000" w:themeColor="text1"/>
               </w:rPr>
             </w:pPr>
-            <w:proofErr w:type="spellStart"/>
             <w:r>
               <w:rPr>
                 <w:b/>
                 <w:color w:val="000000" w:themeColor="text1"/>
                 <w:sz w:val="18"/>
               </w:rPr>
-              <w:t>Requerimiento</w:t>
-            </w:r>
-            <w:proofErr w:type="spellEnd"/>
-            <w:r>
-              <w:rPr>
-                <w:b/>
-                <w:color w:val="000000" w:themeColor="text1"/>
-                <w:sz w:val="18"/>
-              </w:rPr>
-              <w:t xml:space="preserve"> </w:t>
-            </w:r>
-            <w:proofErr w:type="spellStart"/>
-            <w:r>
-              <w:rPr>
-                <w:b/>
-                <w:color w:val="000000" w:themeColor="text1"/>
-                <w:sz w:val="18"/>
-              </w:rPr>
-              <w:t>funcional</w:t>
-            </w:r>
-            <w:proofErr w:type="spellEnd"/>
+              <w:t>Requerimiento funcional</w:t>
+            </w:r>
           </w:p>
         </w:tc>
         <w:tc>
@@ -3985,7 +3868,6 @@
                 <w:color w:val="000000" w:themeColor="text1"/>
               </w:rPr>
             </w:pPr>
-            <w:proofErr w:type="spellStart"/>
             <w:r>
               <w:rPr>
                 <w:b/>
@@ -3994,7 +3876,6 @@
               </w:rPr>
               <w:t>Prioridad</w:t>
             </w:r>
-            <w:proofErr w:type="spellEnd"/>
           </w:p>
         </w:tc>
         <w:tc>
@@ -4443,34 +4324,14 @@
                 <w:color w:val="000000" w:themeColor="text1"/>
               </w:rPr>
             </w:pPr>
-            <w:proofErr w:type="spellStart"/>
             <w:r>
               <w:rPr>
                 <w:b/>
                 <w:color w:val="000000" w:themeColor="text1"/>
                 <w:sz w:val="18"/>
               </w:rPr>
-              <w:t>Requerimiento</w:t>
-            </w:r>
-            <w:proofErr w:type="spellEnd"/>
-            <w:r>
-              <w:rPr>
-                <w:b/>
-                <w:color w:val="000000" w:themeColor="text1"/>
-                <w:sz w:val="18"/>
-              </w:rPr>
-              <w:t xml:space="preserve"> </w:t>
-            </w:r>
-            <w:proofErr w:type="spellStart"/>
-            <w:r>
-              <w:rPr>
-                <w:b/>
-                <w:color w:val="000000" w:themeColor="text1"/>
-                <w:sz w:val="18"/>
-              </w:rPr>
-              <w:t>funcional</w:t>
-            </w:r>
-            <w:proofErr w:type="spellEnd"/>
+              <w:t>Requerimiento funcional</w:t>
+            </w:r>
           </w:p>
         </w:tc>
         <w:tc>
@@ -4485,7 +4346,6 @@
                 <w:color w:val="000000" w:themeColor="text1"/>
               </w:rPr>
             </w:pPr>
-            <w:proofErr w:type="spellStart"/>
             <w:r>
               <w:rPr>
                 <w:b/>
@@ -4494,7 +4354,6 @@
               </w:rPr>
               <w:t>Prioridad</w:t>
             </w:r>
-            <w:proofErr w:type="spellEnd"/>
           </w:p>
         </w:tc>
         <w:tc>
@@ -5129,34 +4988,14 @@
                 <w:color w:val="000000" w:themeColor="text1"/>
               </w:rPr>
             </w:pPr>
-            <w:proofErr w:type="spellStart"/>
             <w:r>
               <w:rPr>
                 <w:b/>
                 <w:color w:val="000000" w:themeColor="text1"/>
                 <w:sz w:val="18"/>
               </w:rPr>
-              <w:t>Requerimiento</w:t>
-            </w:r>
-            <w:proofErr w:type="spellEnd"/>
-            <w:r>
-              <w:rPr>
-                <w:b/>
-                <w:color w:val="000000" w:themeColor="text1"/>
-                <w:sz w:val="18"/>
-              </w:rPr>
-              <w:t xml:space="preserve"> </w:t>
-            </w:r>
-            <w:proofErr w:type="spellStart"/>
-            <w:r>
-              <w:rPr>
-                <w:b/>
-                <w:color w:val="000000" w:themeColor="text1"/>
-                <w:sz w:val="18"/>
-              </w:rPr>
-              <w:t>funcional</w:t>
-            </w:r>
-            <w:proofErr w:type="spellEnd"/>
+              <w:t>Requerimiento funcional</w:t>
+            </w:r>
           </w:p>
         </w:tc>
         <w:tc>
@@ -5171,7 +5010,6 @@
                 <w:color w:val="000000" w:themeColor="text1"/>
               </w:rPr>
             </w:pPr>
-            <w:proofErr w:type="spellStart"/>
             <w:r>
               <w:rPr>
                 <w:b/>
@@ -5180,7 +5018,6 @@
               </w:rPr>
               <w:t>Prioridad</w:t>
             </w:r>
-            <w:proofErr w:type="spellEnd"/>
           </w:p>
         </w:tc>
         <w:tc>
@@ -5922,17 +5759,9 @@
         <w:rPr>
           <w:color w:val="000000" w:themeColor="text1"/>
         </w:rPr>
-        <w:t xml:space="preserve">RF-037 a RF-040 — </w:t>
-      </w:r>
-      <w:proofErr w:type="spellStart"/>
-      <w:r>
-        <w:rPr>
-          <w:color w:val="000000" w:themeColor="text1"/>
-        </w:rPr>
-        <w:t>Inventario</w:t>
+        <w:t>RF-037 a RF-040 — Inventario</w:t>
       </w:r>
       <w:bookmarkEnd w:id="7"/>
-      <w:proofErr w:type="spellEnd"/>
     </w:p>
     <w:tbl>
       <w:tblPr>
@@ -5985,34 +5814,14 @@
                 <w:color w:val="000000" w:themeColor="text1"/>
               </w:rPr>
             </w:pPr>
-            <w:proofErr w:type="spellStart"/>
             <w:r>
               <w:rPr>
                 <w:b/>
                 <w:color w:val="000000" w:themeColor="text1"/>
                 <w:sz w:val="18"/>
               </w:rPr>
-              <w:t>Requerimiento</w:t>
-            </w:r>
-            <w:proofErr w:type="spellEnd"/>
-            <w:r>
-              <w:rPr>
-                <w:b/>
-                <w:color w:val="000000" w:themeColor="text1"/>
-                <w:sz w:val="18"/>
-              </w:rPr>
-              <w:t xml:space="preserve"> </w:t>
-            </w:r>
-            <w:proofErr w:type="spellStart"/>
-            <w:r>
-              <w:rPr>
-                <w:b/>
-                <w:color w:val="000000" w:themeColor="text1"/>
-                <w:sz w:val="18"/>
-              </w:rPr>
-              <w:t>funcional</w:t>
-            </w:r>
-            <w:proofErr w:type="spellEnd"/>
+              <w:t>Requerimiento funcional</w:t>
+            </w:r>
           </w:p>
         </w:tc>
         <w:tc>
@@ -6027,7 +5836,6 @@
                 <w:color w:val="000000" w:themeColor="text1"/>
               </w:rPr>
             </w:pPr>
-            <w:proofErr w:type="spellStart"/>
             <w:r>
               <w:rPr>
                 <w:b/>
@@ -6036,7 +5844,6 @@
               </w:rPr>
               <w:t>Prioridad</w:t>
             </w:r>
-            <w:proofErr w:type="spellEnd"/>
           </w:p>
         </w:tc>
         <w:tc>
@@ -6430,17 +6237,9 @@
         <w:rPr>
           <w:color w:val="000000" w:themeColor="text1"/>
         </w:rPr>
-        <w:t xml:space="preserve">RF-041 a RF-043 — </w:t>
-      </w:r>
-      <w:proofErr w:type="spellStart"/>
-      <w:r>
-        <w:rPr>
-          <w:color w:val="000000" w:themeColor="text1"/>
-        </w:rPr>
-        <w:t>Reportes</w:t>
+        <w:t>RF-041 a RF-043 — Reportes</w:t>
       </w:r>
       <w:bookmarkEnd w:id="8"/>
-      <w:proofErr w:type="spellEnd"/>
     </w:p>
     <w:tbl>
       <w:tblPr>
@@ -6493,34 +6292,14 @@
                 <w:color w:val="000000" w:themeColor="text1"/>
               </w:rPr>
             </w:pPr>
-            <w:proofErr w:type="spellStart"/>
             <w:r>
               <w:rPr>
                 <w:b/>
                 <w:color w:val="000000" w:themeColor="text1"/>
                 <w:sz w:val="18"/>
               </w:rPr>
-              <w:t>Requerimiento</w:t>
-            </w:r>
-            <w:proofErr w:type="spellEnd"/>
-            <w:r>
-              <w:rPr>
-                <w:b/>
-                <w:color w:val="000000" w:themeColor="text1"/>
-                <w:sz w:val="18"/>
-              </w:rPr>
-              <w:t xml:space="preserve"> </w:t>
-            </w:r>
-            <w:proofErr w:type="spellStart"/>
-            <w:r>
-              <w:rPr>
-                <w:b/>
-                <w:color w:val="000000" w:themeColor="text1"/>
-                <w:sz w:val="18"/>
-              </w:rPr>
-              <w:t>funcional</w:t>
-            </w:r>
-            <w:proofErr w:type="spellEnd"/>
+              <w:t>Requerimiento funcional</w:t>
+            </w:r>
           </w:p>
         </w:tc>
         <w:tc>
@@ -6535,7 +6314,6 @@
                 <w:color w:val="000000" w:themeColor="text1"/>
               </w:rPr>
             </w:pPr>
-            <w:proofErr w:type="spellStart"/>
             <w:r>
               <w:rPr>
                 <w:b/>
@@ -6544,7 +6322,6 @@
               </w:rPr>
               <w:t>Prioridad</w:t>
             </w:r>
-            <w:proofErr w:type="spellEnd"/>
           </w:p>
         </w:tc>
         <w:tc>
@@ -6851,31 +6628,9 @@
         <w:rPr>
           <w:color w:val="000000" w:themeColor="text1"/>
         </w:rPr>
-        <w:t xml:space="preserve">2. </w:t>
-      </w:r>
-      <w:proofErr w:type="spellStart"/>
-      <w:r>
-        <w:rPr>
-          <w:color w:val="000000" w:themeColor="text1"/>
-        </w:rPr>
-        <w:t>Requerimientos</w:t>
-      </w:r>
-      <w:proofErr w:type="spellEnd"/>
-      <w:r>
-        <w:rPr>
-          <w:color w:val="000000" w:themeColor="text1"/>
-        </w:rPr>
-        <w:t xml:space="preserve"> no </w:t>
-      </w:r>
-      <w:proofErr w:type="spellStart"/>
-      <w:r>
-        <w:rPr>
-          <w:color w:val="000000" w:themeColor="text1"/>
-        </w:rPr>
-        <w:t>funcionales</w:t>
+        <w:t>2. Requerimientos no funcionales</w:t>
       </w:r>
       <w:bookmarkEnd w:id="9"/>
-      <w:proofErr w:type="spellEnd"/>
     </w:p>
     <w:p>
       <w:pPr>
@@ -6889,17 +6644,9 @@
         <w:rPr>
           <w:color w:val="000000" w:themeColor="text1"/>
         </w:rPr>
-        <w:t xml:space="preserve">RNF de </w:t>
-      </w:r>
-      <w:proofErr w:type="spellStart"/>
-      <w:r>
-        <w:rPr>
-          <w:color w:val="000000" w:themeColor="text1"/>
-        </w:rPr>
-        <w:t>seguridad</w:t>
+        <w:t>RNF de seguridad</w:t>
       </w:r>
       <w:bookmarkEnd w:id="10"/>
-      <w:proofErr w:type="spellEnd"/>
     </w:p>
     <w:tbl>
       <w:tblPr>
@@ -6950,7 +6697,6 @@
                 <w:color w:val="000000" w:themeColor="text1"/>
               </w:rPr>
             </w:pPr>
-            <w:proofErr w:type="spellStart"/>
             <w:r>
               <w:rPr>
                 <w:b/>
@@ -6959,7 +6705,6 @@
               </w:rPr>
               <w:t>Requerimiento</w:t>
             </w:r>
-            <w:proofErr w:type="spellEnd"/>
           </w:p>
         </w:tc>
       </w:tr>
@@ -7219,17 +6964,9 @@
         <w:rPr>
           <w:color w:val="000000" w:themeColor="text1"/>
         </w:rPr>
-        <w:t xml:space="preserve">RNF de </w:t>
-      </w:r>
-      <w:proofErr w:type="spellStart"/>
-      <w:r>
-        <w:rPr>
-          <w:color w:val="000000" w:themeColor="text1"/>
-        </w:rPr>
-        <w:t>rendimiento</w:t>
+        <w:t>RNF de rendimiento</w:t>
       </w:r>
       <w:bookmarkEnd w:id="11"/>
-      <w:proofErr w:type="spellEnd"/>
     </w:p>
     <w:tbl>
       <w:tblPr>
@@ -7280,7 +7017,6 @@
                 <w:color w:val="000000" w:themeColor="text1"/>
               </w:rPr>
             </w:pPr>
-            <w:proofErr w:type="spellStart"/>
             <w:r>
               <w:rPr>
                 <w:b/>
@@ -7289,7 +7025,6 @@
               </w:rPr>
               <w:t>Requerimiento</w:t>
             </w:r>
-            <w:proofErr w:type="spellEnd"/>
           </w:p>
         </w:tc>
       </w:tr>
@@ -7455,31 +7190,9 @@
         <w:rPr>
           <w:color w:val="000000" w:themeColor="text1"/>
         </w:rPr>
-        <w:t xml:space="preserve">RNF de </w:t>
-      </w:r>
-      <w:proofErr w:type="spellStart"/>
-      <w:r>
-        <w:rPr>
-          <w:color w:val="000000" w:themeColor="text1"/>
-        </w:rPr>
-        <w:t>disponibilidad</w:t>
-      </w:r>
-      <w:proofErr w:type="spellEnd"/>
-      <w:r>
-        <w:rPr>
-          <w:color w:val="000000" w:themeColor="text1"/>
-        </w:rPr>
-        <w:t xml:space="preserve"> y </w:t>
-      </w:r>
-      <w:proofErr w:type="spellStart"/>
-      <w:r>
-        <w:rPr>
-          <w:color w:val="000000" w:themeColor="text1"/>
-        </w:rPr>
-        <w:t>recuperación</w:t>
+        <w:t>RNF de disponibilidad y recuperación</w:t>
       </w:r>
       <w:bookmarkEnd w:id="12"/>
-      <w:proofErr w:type="spellEnd"/>
     </w:p>
     <w:tbl>
       <w:tblPr>
@@ -7530,7 +7243,6 @@
                 <w:color w:val="000000" w:themeColor="text1"/>
               </w:rPr>
             </w:pPr>
-            <w:proofErr w:type="spellStart"/>
             <w:r>
               <w:rPr>
                 <w:b/>
@@ -7539,7 +7251,6 @@
               </w:rPr>
               <w:t>Requerimiento</w:t>
             </w:r>
-            <w:proofErr w:type="spellEnd"/>
           </w:p>
         </w:tc>
       </w:tr>
@@ -7658,17 +7369,9 @@
         <w:rPr>
           <w:color w:val="000000" w:themeColor="text1"/>
         </w:rPr>
-        <w:t xml:space="preserve">RNF de </w:t>
-      </w:r>
-      <w:proofErr w:type="spellStart"/>
-      <w:r>
-        <w:rPr>
-          <w:color w:val="000000" w:themeColor="text1"/>
-        </w:rPr>
-        <w:t>usabilidad</w:t>
+        <w:t>RNF de usabilidad</w:t>
       </w:r>
       <w:bookmarkEnd w:id="13"/>
-      <w:proofErr w:type="spellEnd"/>
     </w:p>
     <w:tbl>
       <w:tblPr>
@@ -7719,7 +7422,6 @@
                 <w:color w:val="000000" w:themeColor="text1"/>
               </w:rPr>
             </w:pPr>
-            <w:proofErr w:type="spellStart"/>
             <w:r>
               <w:rPr>
                 <w:b/>
@@ -7728,7 +7430,6 @@
               </w:rPr>
               <w:t>Requerimiento</w:t>
             </w:r>
-            <w:proofErr w:type="spellEnd"/>
           </w:p>
         </w:tc>
       </w:tr>
@@ -7941,17 +7642,9 @@
         <w:rPr>
           <w:color w:val="000000" w:themeColor="text1"/>
         </w:rPr>
-        <w:t xml:space="preserve">RNF de </w:t>
-      </w:r>
-      <w:proofErr w:type="spellStart"/>
-      <w:r>
-        <w:rPr>
-          <w:color w:val="000000" w:themeColor="text1"/>
-        </w:rPr>
-        <w:t>mantenibilidad</w:t>
+        <w:t>RNF de mantenibilidad</w:t>
       </w:r>
       <w:bookmarkEnd w:id="14"/>
-      <w:proofErr w:type="spellEnd"/>
     </w:p>
     <w:tbl>
       <w:tblPr>
@@ -8002,7 +7695,6 @@
                 <w:color w:val="000000" w:themeColor="text1"/>
               </w:rPr>
             </w:pPr>
-            <w:proofErr w:type="spellStart"/>
             <w:r>
               <w:rPr>
                 <w:b/>
@@ -8011,7 +7703,6 @@
               </w:rPr>
               <w:t>Requerimiento</w:t>
             </w:r>
-            <w:proofErr w:type="spellEnd"/>
           </w:p>
         </w:tc>
       </w:tr>
@@ -8177,17 +7868,9 @@
         <w:rPr>
           <w:color w:val="000000" w:themeColor="text1"/>
         </w:rPr>
-        <w:t xml:space="preserve">RNF de </w:t>
-      </w:r>
-      <w:proofErr w:type="spellStart"/>
-      <w:r>
-        <w:rPr>
-          <w:color w:val="000000" w:themeColor="text1"/>
-        </w:rPr>
-        <w:t>compatibilidad</w:t>
+        <w:t>RNF de compatibilidad</w:t>
       </w:r>
       <w:bookmarkEnd w:id="15"/>
-      <w:proofErr w:type="spellEnd"/>
     </w:p>
     <w:tbl>
       <w:tblPr>
@@ -8238,7 +7921,6 @@
                 <w:color w:val="000000" w:themeColor="text1"/>
               </w:rPr>
             </w:pPr>
-            <w:proofErr w:type="spellStart"/>
             <w:r>
               <w:rPr>
                 <w:b/>
@@ -8247,7 +7929,6 @@
               </w:rPr>
               <w:t>Requerimiento</w:t>
             </w:r>
-            <w:proofErr w:type="spellEnd"/>
           </w:p>
         </w:tc>
       </w:tr>
@@ -8400,17 +8081,9 @@
         <w:rPr>
           <w:color w:val="000000" w:themeColor="text1"/>
         </w:rPr>
-        <w:t xml:space="preserve">3.1 Reglas </w:t>
-      </w:r>
-      <w:proofErr w:type="spellStart"/>
-      <w:r>
-        <w:rPr>
-          <w:color w:val="000000" w:themeColor="text1"/>
-        </w:rPr>
-        <w:t>generales</w:t>
+        <w:t>3.1 Reglas generales</w:t>
       </w:r>
       <w:bookmarkEnd w:id="17"/>
-      <w:proofErr w:type="spellEnd"/>
     </w:p>
     <w:tbl>
       <w:tblPr>
@@ -8467,18 +8140,8 @@
                 <w:color w:val="000000" w:themeColor="text1"/>
                 <w:sz w:val="18"/>
               </w:rPr>
-              <w:t xml:space="preserve">Regla de </w:t>
-            </w:r>
-            <w:proofErr w:type="spellStart"/>
-            <w:r>
-              <w:rPr>
-                <w:b/>
-                <w:color w:val="000000" w:themeColor="text1"/>
-                <w:sz w:val="18"/>
-              </w:rPr>
-              <w:t>negocio</w:t>
-            </w:r>
-            <w:proofErr w:type="spellEnd"/>
+              <w:t>Regla de negocio</w:t>
+            </w:r>
           </w:p>
         </w:tc>
       </w:tr>
@@ -8786,17 +8449,9 @@
         <w:rPr>
           <w:color w:val="000000" w:themeColor="text1"/>
         </w:rPr>
-        <w:t xml:space="preserve">3.2 Reglas </w:t>
-      </w:r>
-      <w:proofErr w:type="spellStart"/>
-      <w:r>
-        <w:rPr>
-          <w:color w:val="000000" w:themeColor="text1"/>
-        </w:rPr>
-        <w:t>específicas</w:t>
+        <w:t>3.2 Reglas específicas</w:t>
       </w:r>
       <w:bookmarkEnd w:id="18"/>
-      <w:proofErr w:type="spellEnd"/>
     </w:p>
     <w:tbl>
       <w:tblPr>
@@ -8853,18 +8508,8 @@
                 <w:color w:val="000000" w:themeColor="text1"/>
                 <w:sz w:val="18"/>
               </w:rPr>
-              <w:t xml:space="preserve">Regla de </w:t>
-            </w:r>
-            <w:proofErr w:type="spellStart"/>
-            <w:r>
-              <w:rPr>
-                <w:b/>
-                <w:color w:val="000000" w:themeColor="text1"/>
-                <w:sz w:val="18"/>
-              </w:rPr>
-              <w:t>negocio</w:t>
-            </w:r>
-            <w:proofErr w:type="spellEnd"/>
+              <w:t>Regla de negocio</w:t>
+            </w:r>
           </w:p>
         </w:tc>
       </w:tr>
@@ -11151,77 +10796,7 @@
         <w:rPr>
           <w:color w:val="000000" w:themeColor="text1"/>
         </w:rPr>
-        <w:t xml:space="preserve">En la </w:t>
-      </w:r>
-      <w:proofErr w:type="spellStart"/>
-      <w:r>
-        <w:rPr>
-          <w:color w:val="000000" w:themeColor="text1"/>
-        </w:rPr>
-        <w:t>implementación</w:t>
-      </w:r>
-      <w:proofErr w:type="spellEnd"/>
-      <w:r>
-        <w:rPr>
-          <w:color w:val="000000" w:themeColor="text1"/>
-        </w:rPr>
-        <w:t xml:space="preserve"> se </w:t>
-      </w:r>
-      <w:proofErr w:type="spellStart"/>
-      <w:r>
-        <w:rPr>
-          <w:color w:val="000000" w:themeColor="text1"/>
-        </w:rPr>
-        <w:t>aplicará</w:t>
-      </w:r>
-      <w:proofErr w:type="spellEnd"/>
-      <w:r>
-        <w:rPr>
-          <w:color w:val="000000" w:themeColor="text1"/>
-        </w:rPr>
-        <w:t xml:space="preserve"> </w:t>
-      </w:r>
-      <w:proofErr w:type="spellStart"/>
-      <w:r>
-        <w:rPr>
-          <w:color w:val="000000" w:themeColor="text1"/>
-        </w:rPr>
-        <w:t>una</w:t>
-      </w:r>
-      <w:proofErr w:type="spellEnd"/>
-      <w:r>
-        <w:rPr>
-          <w:color w:val="000000" w:themeColor="text1"/>
-        </w:rPr>
-        <w:t xml:space="preserve"> sola </w:t>
-      </w:r>
-      <w:proofErr w:type="spellStart"/>
-      <w:r>
-        <w:rPr>
-          <w:color w:val="000000" w:themeColor="text1"/>
-        </w:rPr>
-        <w:t>regla</w:t>
-      </w:r>
-      <w:proofErr w:type="spellEnd"/>
-      <w:r>
-        <w:rPr>
-          <w:color w:val="000000" w:themeColor="text1"/>
-        </w:rPr>
-        <w:t xml:space="preserve"> </w:t>
-      </w:r>
-      <w:proofErr w:type="spellStart"/>
-      <w:r>
-        <w:rPr>
-          <w:color w:val="000000" w:themeColor="text1"/>
-        </w:rPr>
-        <w:t>efectiva</w:t>
-      </w:r>
-      <w:proofErr w:type="spellEnd"/>
-      <w:r>
-        <w:rPr>
-          <w:color w:val="000000" w:themeColor="text1"/>
-        </w:rPr>
-        <w:t>.</w:t>
+        <w:t>En la implementación se aplicará una sola regla efectiva.</w:t>
       </w:r>
     </w:p>
     <w:p>
@@ -11236,17 +10811,9 @@
         <w:rPr>
           <w:color w:val="000000" w:themeColor="text1"/>
         </w:rPr>
-        <w:t xml:space="preserve">4. </w:t>
-      </w:r>
-      <w:proofErr w:type="spellStart"/>
-      <w:r>
-        <w:rPr>
-          <w:color w:val="000000" w:themeColor="text1"/>
-        </w:rPr>
-        <w:t>Restricciones</w:t>
+        <w:t>4. Restricciones</w:t>
       </w:r>
       <w:bookmarkEnd w:id="19"/>
-      <w:proofErr w:type="spellEnd"/>
     </w:p>
     <w:tbl>
       <w:tblPr>
@@ -11297,7 +10864,6 @@
                 <w:color w:val="000000" w:themeColor="text1"/>
               </w:rPr>
             </w:pPr>
-            <w:proofErr w:type="spellStart"/>
             <w:r>
               <w:rPr>
                 <w:b/>
@@ -11306,7 +10872,6 @@
               </w:rPr>
               <w:t>Restricción</w:t>
             </w:r>
-            <w:proofErr w:type="spellEnd"/>
           </w:p>
         </w:tc>
       </w:tr>
@@ -11352,25 +10917,7 @@
                 <w:sz w:val="18"/>
                 <w:lang w:val="es-CO"/>
               </w:rPr>
-              <w:t xml:space="preserve">El sistema estará desarrollado inicialmente para una única floristería y no como plataforma </w:t>
-            </w:r>
-            <w:proofErr w:type="spellStart"/>
-            <w:r>
-              <w:rPr>
-                <w:color w:val="000000" w:themeColor="text1"/>
-                <w:sz w:val="18"/>
-                <w:lang w:val="es-CO"/>
-              </w:rPr>
-              <w:t>multi-tienda</w:t>
-            </w:r>
-            <w:proofErr w:type="spellEnd"/>
-            <w:r>
-              <w:rPr>
-                <w:color w:val="000000" w:themeColor="text1"/>
-                <w:sz w:val="18"/>
-                <w:lang w:val="es-CO"/>
-              </w:rPr>
-              <w:t>/SaaS.</w:t>
+              <w:t>El sistema estará desarrollado inicialmente para una única floristería y no como plataforma multi-tienda/SaaS.</w:t>
             </w:r>
           </w:p>
         </w:tc>
@@ -11908,52 +11455,14 @@
                 <w:color w:val="000000" w:themeColor="text1"/>
               </w:rPr>
             </w:pPr>
-            <w:proofErr w:type="spellStart"/>
             <w:r>
               <w:rPr>
                 <w:b/>
                 <w:color w:val="000000" w:themeColor="text1"/>
                 <w:sz w:val="18"/>
               </w:rPr>
-              <w:t>Criterio</w:t>
-            </w:r>
-            <w:proofErr w:type="spellEnd"/>
-            <w:r>
-              <w:rPr>
-                <w:b/>
-                <w:color w:val="000000" w:themeColor="text1"/>
-                <w:sz w:val="18"/>
-              </w:rPr>
-              <w:t xml:space="preserve"> de </w:t>
-            </w:r>
-            <w:proofErr w:type="spellStart"/>
-            <w:r>
-              <w:rPr>
-                <w:b/>
-                <w:color w:val="000000" w:themeColor="text1"/>
-                <w:sz w:val="18"/>
-              </w:rPr>
-              <w:t>aceptación</w:t>
-            </w:r>
-            <w:proofErr w:type="spellEnd"/>
-            <w:r>
-              <w:rPr>
-                <w:b/>
-                <w:color w:val="000000" w:themeColor="text1"/>
-                <w:sz w:val="18"/>
-              </w:rPr>
-              <w:t xml:space="preserve"> </w:t>
-            </w:r>
-            <w:proofErr w:type="spellStart"/>
-            <w:r>
-              <w:rPr>
-                <w:b/>
-                <w:color w:val="000000" w:themeColor="text1"/>
-                <w:sz w:val="18"/>
-              </w:rPr>
-              <w:t>consolidado</w:t>
-            </w:r>
-            <w:proofErr w:type="spellEnd"/>
+              <w:t>Criterio de aceptación consolidado</w:t>
+            </w:r>
           </w:p>
         </w:tc>
       </w:tr>
@@ -12279,87 +11788,7 @@
                 <w:color w:val="000000" w:themeColor="text1"/>
                 <w:sz w:val="18"/>
               </w:rPr>
-              <w:t xml:space="preserve">Los </w:t>
-            </w:r>
-            <w:proofErr w:type="spellStart"/>
-            <w:r>
-              <w:rPr>
-                <w:color w:val="000000" w:themeColor="text1"/>
-                <w:sz w:val="18"/>
-              </w:rPr>
-              <w:t>visitantes</w:t>
-            </w:r>
-            <w:proofErr w:type="spellEnd"/>
-            <w:r>
-              <w:rPr>
-                <w:color w:val="000000" w:themeColor="text1"/>
-                <w:sz w:val="18"/>
-              </w:rPr>
-              <w:t xml:space="preserve"> </w:t>
-            </w:r>
-            <w:proofErr w:type="spellStart"/>
-            <w:r>
-              <w:rPr>
-                <w:color w:val="000000" w:themeColor="text1"/>
-                <w:sz w:val="18"/>
-              </w:rPr>
-              <w:t>visualizan</w:t>
-            </w:r>
-            <w:proofErr w:type="spellEnd"/>
-            <w:r>
-              <w:rPr>
-                <w:color w:val="000000" w:themeColor="text1"/>
-                <w:sz w:val="18"/>
-              </w:rPr>
-              <w:t xml:space="preserve"> </w:t>
-            </w:r>
-            <w:proofErr w:type="spellStart"/>
-            <w:r>
-              <w:rPr>
-                <w:color w:val="000000" w:themeColor="text1"/>
-                <w:sz w:val="18"/>
-              </w:rPr>
-              <w:t>únicamente</w:t>
-            </w:r>
-            <w:proofErr w:type="spellEnd"/>
-            <w:r>
-              <w:rPr>
-                <w:color w:val="000000" w:themeColor="text1"/>
-                <w:sz w:val="18"/>
-              </w:rPr>
-              <w:t xml:space="preserve"> </w:t>
-            </w:r>
-            <w:proofErr w:type="spellStart"/>
-            <w:r>
-              <w:rPr>
-                <w:color w:val="000000" w:themeColor="text1"/>
-                <w:sz w:val="18"/>
-              </w:rPr>
-              <w:t>productos</w:t>
-            </w:r>
-            <w:proofErr w:type="spellEnd"/>
-            <w:r>
-              <w:rPr>
-                <w:color w:val="000000" w:themeColor="text1"/>
-                <w:sz w:val="18"/>
-              </w:rPr>
-              <w:t xml:space="preserve"> </w:t>
-            </w:r>
-            <w:proofErr w:type="spellStart"/>
-            <w:r>
-              <w:rPr>
-                <w:color w:val="000000" w:themeColor="text1"/>
-                <w:sz w:val="18"/>
-              </w:rPr>
-              <w:t>activos</w:t>
-            </w:r>
-            <w:proofErr w:type="spellEnd"/>
-            <w:r>
-              <w:rPr>
-                <w:color w:val="000000" w:themeColor="text1"/>
-                <w:sz w:val="18"/>
-              </w:rPr>
-              <w:t>.</w:t>
+              <w:t>Los visitantes visualizan únicamente productos activos.</w:t>
             </w:r>
           </w:p>
         </w:tc>
@@ -14169,7 +13598,6 @@
                 <w:color w:val="000000" w:themeColor="text1"/>
               </w:rPr>
             </w:pPr>
-            <w:proofErr w:type="spellStart"/>
             <w:r>
               <w:rPr>
                 <w:b/>
@@ -14178,7 +13606,6 @@
               </w:rPr>
               <w:t>Épica</w:t>
             </w:r>
-            <w:proofErr w:type="spellEnd"/>
           </w:p>
         </w:tc>
         <w:tc>
@@ -14221,36 +13648,8 @@
                 <w:color w:val="000000" w:themeColor="text1"/>
                 <w:sz w:val="18"/>
               </w:rPr>
-              <w:t xml:space="preserve">Reglas de </w:t>
-            </w:r>
-            <w:proofErr w:type="spellStart"/>
-            <w:r>
-              <w:rPr>
-                <w:b/>
-                <w:color w:val="000000" w:themeColor="text1"/>
-                <w:sz w:val="18"/>
-              </w:rPr>
-              <w:t>negocio</w:t>
-            </w:r>
-            <w:proofErr w:type="spellEnd"/>
-            <w:r>
-              <w:rPr>
-                <w:b/>
-                <w:color w:val="000000" w:themeColor="text1"/>
-                <w:sz w:val="18"/>
-              </w:rPr>
-              <w:t xml:space="preserve"> </w:t>
-            </w:r>
-            <w:proofErr w:type="spellStart"/>
-            <w:r>
-              <w:rPr>
-                <w:b/>
-                <w:color w:val="000000" w:themeColor="text1"/>
-                <w:sz w:val="18"/>
-              </w:rPr>
-              <w:t>aplicables</w:t>
-            </w:r>
-            <w:proofErr w:type="spellEnd"/>
+              <w:t>Reglas de negocio aplicables</w:t>
+            </w:r>
           </w:p>
         </w:tc>
         <w:tc>
@@ -14265,34 +13664,14 @@
                 <w:color w:val="000000" w:themeColor="text1"/>
               </w:rPr>
             </w:pPr>
-            <w:proofErr w:type="spellStart"/>
             <w:r>
               <w:rPr>
                 <w:b/>
                 <w:color w:val="000000" w:themeColor="text1"/>
                 <w:sz w:val="18"/>
               </w:rPr>
-              <w:t>Criterio</w:t>
-            </w:r>
-            <w:proofErr w:type="spellEnd"/>
-            <w:r>
-              <w:rPr>
-                <w:b/>
-                <w:color w:val="000000" w:themeColor="text1"/>
-                <w:sz w:val="18"/>
-              </w:rPr>
-              <w:t xml:space="preserve"> de </w:t>
-            </w:r>
-            <w:proofErr w:type="spellStart"/>
-            <w:r>
-              <w:rPr>
-                <w:b/>
-                <w:color w:val="000000" w:themeColor="text1"/>
-                <w:sz w:val="18"/>
-              </w:rPr>
-              <w:t>aceptación</w:t>
-            </w:r>
-            <w:proofErr w:type="spellEnd"/>
+              <w:t>Criterio de aceptación</w:t>
+            </w:r>
           </w:p>
         </w:tc>
       </w:tr>
@@ -18786,7 +18165,7 @@
                 <w:color w:val="000000" w:themeColor="text1"/>
                 <w:sz w:val="18"/>
               </w:rPr>
-              <w:t>RN-</w:t>
+              <w:t>RN</w:t>
             </w:r>
             <w:r>
               <w:rPr>

</xml_diff>